<commit_message>
Add remaining umbrella documents, foundation and master index
Adds Class 6-10 foundation, Law, Defence, Design and Architecture,
Hospitality/Aviation/Maritime, Health and Allied, Agriculture/Veterinary/
Forestry, Polytechnic and ITI, Skills and Entrepreneurship, and Sports and
Arts documents (Word and PDF), plus a master index with a month-by-month
exam calendar and the proposed website structure for Patil Sir review.

Updates the Science PCB and PCM drafts with new findings (Karnataka nursing
via KCET, BVSc via NEET, allied health NEET rule, CBSE Basic Maths
relaxation). All content remains AI-drafted and web-checked from secondary
sources; [VERIFY] items need confirmation on official sites.

Co-Authored-By: Claude Sonnet 5.5 <noreply@anthropic.com>
</commit_message>
<xml_diff>
--- a/career-roadmap/Science-PCB-Pathway-DRAFT.docx
+++ b/career-roadmap/Science-PCB-Pathway-DRAFT.docx
@@ -1270,7 +1270,7 @@
           <w:sz w:val="20"/>
           <w:szCs w:val="20"/>
         </w:rPr>
-        <w:t xml:space="preserve">Decision: in CBSE, choose Standard or Basic Maths for Class 10. PCB itself does not need Standard Maths, but Basic Maths closes the PCMB/Engineering option later. Take Standard if undecided. </w:t>
+        <w:t xml:space="preserve">Decision: in CBSE, choose Standard or Basic Maths for Class 10. PCB itself does not need Standard Maths, but Basic Maths closes the PCMB/Engineering option later. Take Standard if undecided. CBSE relaxed the rule for 2023-24 and 2025-26 (Basic Maths students may take Maths in Class 11 if the school agrees) but it may end with the new scheme. </w:t>
       </w:r>
       <w:r>
         <w:rPr>
@@ -1281,7 +1281,7 @@
           <w:szCs w:val="20"/>
           <w:highlight w:val="yellow"/>
         </w:rPr>
-        <w:t xml:space="preserve">[VERIFY: Karnataka SSLC has a single Maths paper]</w:t>
+        <w:t xml:space="preserve">[VERIFY CBSE circular; Karnataka SSLC rule not found]</w:t>
       </w:r>
     </w:p>
     <w:p>
@@ -5845,7 +5845,7 @@
                 <w:sz w:val="18"/>
                 <w:szCs w:val="18"/>
               </w:rPr>
-              <w:t xml:space="preserve">One college page cites KCET (KEA) per a 2023 government order; other listings say INC norms plus RGUHS counselling. NEET is used by some national institutes. Check rguhs.ac.in and kea.kar.nic.in </w:t>
+              <w:t xml:space="preserve">KCET (KEA) per an April 2023 government order; NEET reported as not required in Karnataka; 45% PCB General / 40% SC/ST, age 17 by 31 Dec; deemed universities (Manipal, Yenepoya) run their own tests. See Health and Allied document. </w:t>
             </w:r>
             <w:r>
               <w:rPr>
@@ -5856,7 +5856,7 @@
                 <w:szCs w:val="18"/>
                 <w:highlight w:val="yellow"/>
               </w:rPr>
-              <w:t xml:space="preserve">[VERIFY]</w:t>
+              <w:t xml:space="preserve">[VERIFY on kea.kar.nic.in and rguhs.ac.in]</w:t>
             </w:r>
           </w:p>
         </w:tc>
@@ -8731,7 +8731,7 @@
                 <w:sz w:val="17"/>
                 <w:szCs w:val="17"/>
               </w:rPr>
-              <w:t xml:space="preserve">NEET-UG</w:t>
+              <w:t xml:space="preserve">NEET-UG; AACCC (15%) + state counselling</w:t>
             </w:r>
           </w:p>
         </w:tc>
@@ -8760,7 +8760,7 @@
                 <w:sz w:val="17"/>
                 <w:szCs w:val="17"/>
               </w:rPr>
-              <w:t xml:space="preserve">AYUSH systems</w:t>
+              <w:t xml:space="preserve">AYUSH systems; see Health and Allied document</w:t>
             </w:r>
           </w:p>
         </w:tc>
@@ -8855,7 +8855,7 @@
                 <w:sz w:val="17"/>
                 <w:szCs w:val="17"/>
               </w:rPr>
-              <w:t xml:space="preserve">NEET-UG</w:t>
+              <w:t xml:space="preserve">NEET-UG merit (VCI)</w:t>
             </w:r>
           </w:p>
         </w:tc>
@@ -8885,18 +8885,7 @@
                 <w:sz w:val="17"/>
                 <w:szCs w:val="17"/>
               </w:rPr>
-              <w:t xml:space="preserve">Veterinary </w:t>
-            </w:r>
-            <w:r>
-              <w:rPr>
-                <w:rFonts w:ascii="Arial" w:cs="Arial" w:eastAsia="Arial" w:hAnsi="Arial"/>
-                <w:b/>
-                <w:bCs/>
-                <w:sz w:val="17"/>
-                <w:szCs w:val="17"/>
-                <w:highlight w:val="yellow"/>
-              </w:rPr>
-              <w:t xml:space="preserve">[VERIFY]</w:t>
+              <w:t xml:space="preserve">Veterinary; 50% PCB (47.5% reserved); see Agriculture document</w:t>
             </w:r>
           </w:p>
         </w:tc>
@@ -8988,7 +8977,7 @@
                 <w:sz w:val="17"/>
                 <w:szCs w:val="17"/>
               </w:rPr>
-              <w:t xml:space="preserve">KCET / RGUHS counselling in Karnataka; NEET at some institutes </w:t>
+              <w:t xml:space="preserve">KCET + KEA counselling in Karnataka </w:t>
             </w:r>
             <w:r>
               <w:rPr>
@@ -9028,7 +9017,7 @@
                 <w:sz w:val="17"/>
                 <w:szCs w:val="17"/>
               </w:rPr>
-              <w:t xml:space="preserve">Hospital and community nursing</w:t>
+              <w:t xml:space="preserve">Hospital and community nursing; see Health and Allied document</w:t>
             </w:r>
           </w:p>
         </w:tc>
@@ -9380,7 +9369,18 @@
                 <w:sz w:val="17"/>
                 <w:szCs w:val="17"/>
               </w:rPr>
-              <w:t xml:space="preserve">State/university entry</w:t>
+              <w:t xml:space="preserve">NEET reported mandatory from 2026-27 (NCAHP) </w:t>
+            </w:r>
+            <w:r>
+              <w:rPr>
+                <w:rFonts w:ascii="Arial" w:cs="Arial" w:eastAsia="Arial" w:hAnsi="Arial"/>
+                <w:b/>
+                <w:bCs/>
+                <w:sz w:val="17"/>
+                <w:szCs w:val="17"/>
+                <w:highlight w:val="yellow"/>
+              </w:rPr>
+              <w:t xml:space="preserve">[VERIFY]</w:t>
             </w:r>
           </w:p>
         </w:tc>
@@ -12759,7 +12759,7 @@
                 <w:sz w:val="16"/>
                 <w:szCs w:val="16"/>
               </w:rPr>
-              <w:t xml:space="preserve">Reported as KCET / RGUHS counselling; NEET at some institutes</w:t>
+              <w:t xml:space="preserve">KCET + KEA counselling; NEET not required in Karnataka; 45% / 40%; deemed universities own tests</w:t>
             </w:r>
           </w:p>
         </w:tc>
@@ -12788,7 +12788,7 @@
                 <w:sz w:val="16"/>
                 <w:szCs w:val="16"/>
               </w:rPr>
-              <w:t xml:space="preserve">Low</w:t>
+              <w:t xml:space="preserve">Medium</w:t>
             </w:r>
           </w:p>
         </w:tc>

</xml_diff>